<commit_message>
Add student name and section to the summary
Co-Authored-By: Claude Opus 5.5 <noreply@anthropic.com>
</commit_message>
<xml_diff>
--- a/docs/17_6621653808_summary.docx
+++ b/docs/17_6621653808_summary.docx
@@ -44,7 +44,7 @@
         <w:t xml:space="preserve">ชื่อ</w:t>
       </w:r>
       <w:r>
-        <w:t xml:space="preserve"> ______________________   </w:t>
+        <w:t xml:space="preserve"> ปรียนัน์ เนื่องชุมพร   </w:t>
       </w:r>
       <w:r>
         <w:rPr>
@@ -64,7 +64,7 @@
         <w:t xml:space="preserve">หมู่</w:t>
       </w:r>
       <w:r>
-        <w:t xml:space="preserve"> ____   </w:t>
+        <w:t xml:space="preserve"> 820   </w:t>
       </w:r>
       <w:r>
         <w:rPr>

</xml_diff>

<commit_message>
Update the timetable to the actual work times
Co-Authored-By: Claude Opus 5.5 <noreply@anthropic.com>
</commit_message>
<xml_diff>
--- a/docs/17_6621653808_summary.docx
+++ b/docs/17_6621653808_summary.docx
@@ -413,7 +413,7 @@
               <w:t xml:space="preserve">ON CONFLICT DO UPDATE</w:t>
             </w:r>
             <w:r>
-              <w:t xml:space="preserve"> (รันซ้ำ 5 รอบ จำนวนแถวคงที่ 1,830), เว็บมี KPI 5 ตัว และตัวกรองชนิดน้ำมัน ผู้ค้า และช่วงวันที่</w:t>
+              <w:t xml:space="preserve"> (รันซ้ำหลายรอบแล้วจำนวนแถวไม่เพิ่ม), เว็บมี KPI 5 ตัว และตัวกรองชนิดน้ำมัน ผู้ค้า และช่วงวันที่</w:t>
             </w:r>
           </w:p>
         </w:tc>
@@ -541,7 +541,7 @@
               <w:t xml:space="preserve">simulate_down=bangchak_api</w:t>
             </w:r>
             <w:r>
-              <w:t xml:space="preserve"> ได้ผลรอบนั้นเป็น partial และยังโหลดได้ครบ 1,830 แถว</w:t>
+              <w:t xml:space="preserve"> ได้ผลรอบนั้นเป็น partial และยังโหลดข้อมูลจากอีก 2 แหล่งได้ครบ</w:t>
             </w:r>
           </w:p>
           <w:p>
@@ -577,7 +577,7 @@
               <w:t xml:space="preserve">Data Quality + branch:</w:t>
             </w:r>
             <w:r>
-              <w:t xml:space="preserve"> ตรวจช่วงราคา 10–100 บาท, วันที่ในอนาคต และราคาที่ต่างจากมัธยฐานของผู้ค้าอื่นเกิน 15% ถ้าไม่ผ่าน DAG จะแตกไปทาง </w:t>
+              <w:t xml:space="preserve"> ตรวจช่วงราคา 10–100 บาท, วันที่ในอนาคต และราคาที่ต่างจากมัธยฐานของผู้ค้าอื่นเกิน 10% ถ้าไม่ผ่าน DAG จะแตกไปทาง </w:t>
             </w:r>
             <w:r>
               <w:rPr>
@@ -599,7 +599,7 @@
               <w:t xml:space="preserve">dq_rejects</w:t>
             </w:r>
             <w:r>
-              <w:t xml:space="preserve"> (พบราคา ESSO ผิดปกติ 90 แถว)</w:t>
+              <w:t xml:space="preserve"> (พบราคา ESSO ผิดปกติ)</w:t>
             </w:r>
           </w:p>
         </w:tc>
@@ -783,7 +783,7 @@
         <w:t xml:space="preserve">__VIEWSTATE</w:t>
       </w:r>
       <w:r>
-        <w:t xml:space="preserve"> แล้ว POST วันที่ ได้ราคาของ 10 ผู้ค้า (ไม่ใช้ Selenium) ปฏิบัติตาม robots.txt, เว้นระยะ request และไม่เก็บข้อมูลส่วนบุคคล ชุดข้อมูลรวมมี 1,830 รายการ ครอบคลุม 30 วัน, 10 ผู้ค้า และ 11 ชนิดน้ำมัน</w:t>
+        <w:t xml:space="preserve"> แล้ว POST วันที่ ได้ราคาของ 10 ผู้ค้า (ไม่ใช้ Selenium) ปฏิบัติตาม robots.txt, เว้นระยะ request และไม่เก็บข้อมูลส่วนบุคคล ชุดข้อมูลรวมมี 1,800 รายการ ครอบคลุม 30 วัน, 10 ผู้ค้า และ 11 ชนิดน้ำมัน</w:t>
       </w:r>
     </w:p>
     <w:p>
@@ -941,7 +941,7 @@
             <w:r>
               <w:drawing>
                 <wp:inline distT="0" distB="0" distL="0" distR="0">
-                  <wp:extent cx="2857500" cy="1428750"/>
+                  <wp:extent cx="2857500" cy="1771650"/>
                   <wp:effectExtent t="0" r="0" b="0" l="0"/>
                   <wp:docPr id="1" name="" descr="" title=""/>
                   <wp:cNvGraphicFramePr>
@@ -966,7 +966,7 @@
                         <pic:spPr bwMode="auto">
                           <a:xfrm>
                             <a:off x="0" y="0"/>
-                            <a:ext cx="2857500" cy="1428750"/>
+                            <a:ext cx="2857500" cy="1771650"/>
                           </a:xfrm>
                           <a:prstGeom prst="rect">
                             <a:avLst/>
@@ -1727,7 +1727,7 @@
         <w:spacing w:before="80" w:after="60"/>
       </w:pPr>
       <w:r>
-        <w:t xml:space="preserve">ข้อสังเกตจาก DQ: ราคา ESSO ใน สนพ. ต่ำกว่าผู้ค้าอื่นประมาณ 20% และวันที่มีผล (24 ก.ย. 2568) ไม่ได้อัปเดต กฎ outlier จึงกักแถวเหล่านี้ไว้ ไม่ให้เข้าชุดข้อมูลหลัก</w:t>
+        <w:t xml:space="preserve">ข้อสังเกตจาก DQ: ราคา ESSO ใน สนพ. ต่ำกว่าผู้ค้าอื่นประมาณ 20% และวันที่มีผล (24 ก.ย. 2568) ไม่ได้อัปเดต ตอนแรกตั้งเกณฑ์ outlier ไว้ 15% แต่ป้ายราคาบน dashboard แสดงว่า ESSO ขาย E20 ถูกที่สุด (ต่างจากราคากลาง 14.7% จึงหลุดเกณฑ์) จึงลดเกณฑ์เป็น 10% ตอนนี้ระบบกักแถวของ ESSO ไว้ 120 แถว ไม่ให้เข้าชุดข้อมูลหลัก</w:t>
       </w:r>
     </w:p>
     <w:p>
@@ -1855,7 +1855,7 @@
               <w:spacing w:after="20"/>
             </w:pPr>
             <w:r>
-              <w:t xml:space="preserve">13:00–13:15</w:t>
+              <w:t xml:space="preserve">13:00–13:10</w:t>
             </w:r>
           </w:p>
         </w:tc>
@@ -1910,7 +1910,7 @@
               <w:spacing w:after="20"/>
             </w:pPr>
             <w:r>
-              <w:t xml:space="preserve">13:15–13:25</w:t>
+              <w:t xml:space="preserve">13:10–13:15</w:t>
             </w:r>
           </w:p>
         </w:tc>
@@ -1965,7 +1965,7 @@
               <w:spacing w:after="20"/>
             </w:pPr>
             <w:r>
-              <w:t xml:space="preserve">13:25–14:10</w:t>
+              <w:t xml:space="preserve">13:15–13:27</w:t>
             </w:r>
           </w:p>
         </w:tc>
@@ -1990,7 +1990,7 @@
               <w:spacing w:after="20"/>
             </w:pPr>
             <w:r>
-              <w:t xml:space="preserve">เขียน DAG ให้ระดับ 1 ใช้งานได้ก่อน แล้วเพิ่ม TaskGroup, UPSERT, การรับมือแหล่งล่ม, การตัดซ้ำ, DQ branch และ Dynamic Task Mapping ตามลำดับ</w:t>
+              <w:t xml:space="preserve">เขียน DAG, Docker Compose และเว็บ dashboard รันครั้งแรก และแก้ปัญหาข้อ 2 กับข้อ 4 (commit แรก 13:27)</w:t>
             </w:r>
           </w:p>
         </w:tc>
@@ -2020,7 +2020,7 @@
               <w:spacing w:after="20"/>
             </w:pPr>
             <w:r>
-              <w:t xml:space="preserve">14:10–14:40</w:t>
+              <w:t xml:space="preserve">13:27–13:35</w:t>
             </w:r>
           </w:p>
         </w:tc>
@@ -2045,7 +2045,7 @@
               <w:spacing w:after="20"/>
             </w:pPr>
             <w:r>
-              <w:t xml:space="preserve">เขียนเว็บ dashboard และหน้า status ทดสอบรันซ้ำ จำลองแหล่งล่ม และแก้ปัญหาข้อ 2–4</w:t>
+              <w:t xml:space="preserve">แก้ปัญหาข้อ 3 ทดสอบกรณีแหล่งล่ม ถ่ายภาพหน้าจอ เขียน README และ PDF แล้วทดสอบรันจากเครื่องเปล่า (commit 13:33)</w:t>
             </w:r>
           </w:p>
         </w:tc>
@@ -2075,7 +2075,7 @@
               <w:spacing w:after="20"/>
             </w:pPr>
             <w:r>
-              <w:t xml:space="preserve">14:40–15:30</w:t>
+              <w:t xml:space="preserve">13:35–14:10</w:t>
             </w:r>
           </w:p>
         </w:tc>
@@ -2100,18 +2100,7 @@
               <w:spacing w:after="20"/>
             </w:pPr>
             <w:r>
-              <w:t xml:space="preserve">ถ่ายภาพหน้าจอ เขียน README และ PDF จากนั้นทดสอบ </w:t>
-            </w:r>
-            <w:r>
-              <w:rPr>
-                <w:sz w:val="16"/>
-                <w:szCs w:val="16"/>
-                <w:rFonts w:ascii="Consolas" w:cs="Consolas" w:eastAsia="Consolas" w:hAnsi="Consolas"/>
-              </w:rPr>
-              <w:t xml:space="preserve">docker compose up</w:t>
-            </w:r>
-            <w:r>
-              <w:t xml:space="preserve"> จาก repo ใหม่ทั้งหมด</w:t>
+              <w:t xml:space="preserve">ทำไฟล์ Word สร้าง repo บน GitHub แล้ว push และเติมข้อมูลผู้จัดทำ (commit 14:06–14:08)</w:t>
             </w:r>
           </w:p>
         </w:tc>
@@ -2141,7 +2130,7 @@
               <w:spacing w:after="20"/>
             </w:pPr>
             <w:r>
-              <w:t xml:space="preserve">15:30–16:00</w:t>
+              <w:t xml:space="preserve">14:10–14:31</w:t>
             </w:r>
           </w:p>
         </w:tc>
@@ -2166,7 +2155,62 @@
               <w:spacing w:after="20"/>
             </w:pPr>
             <w:r>
-              <w:t xml:space="preserve">เวลาสำรอง: push ขึ้น GitHub ตรวจว่า repo เป็น public และส่งงาน</w:t>
+              <w:t xml:space="preserve">ปรับหน้า dashboard (ป้ายราคา ธีมเหลือง-แดง โลโก้ สีประจำแบรนด์) ระหว่างนั้นพบปัญหาราคา ESSO จึงลดเกณฑ์ DQ เป็น 10%</w:t>
+            </w:r>
+          </w:p>
+        </w:tc>
+      </w:tr>
+      <w:tr>
+        <w:trPr>
+          <w:tblHeader w:val="false"/>
+        </w:trPr>
+        <w:tc>
+          <w:tcPr>
+            <w:tcW w:type="dxa" w:w="1700"/>
+            <w:tcBorders>
+              <w:top w:val="single" w:color="BBBBBB" w:sz="4"/>
+              <w:left w:val="single" w:color="BBBBBB" w:sz="4"/>
+              <w:bottom w:val="single" w:color="BBBBBB" w:sz="4"/>
+              <w:right w:val="single" w:color="BBBBBB" w:sz="4"/>
+            </w:tcBorders>
+            <w:tcMar>
+              <w:top w:type="dxa" w:w="40"/>
+              <w:left w:type="dxa" w:w="80"/>
+              <w:bottom w:type="dxa" w:w="40"/>
+              <w:right w:type="dxa" w:w="80"/>
+            </w:tcMar>
+          </w:tcPr>
+          <w:p>
+            <w:pPr>
+              <w:spacing w:after="20"/>
+            </w:pPr>
+            <w:r>
+              <w:t xml:space="preserve">14:31–14:50</w:t>
+            </w:r>
+          </w:p>
+        </w:tc>
+        <w:tc>
+          <w:tcPr>
+            <w:tcW w:type="dxa" w:w="8200"/>
+            <w:tcBorders>
+              <w:top w:val="single" w:color="BBBBBB" w:sz="4"/>
+              <w:left w:val="single" w:color="BBBBBB" w:sz="4"/>
+              <w:bottom w:val="single" w:color="BBBBBB" w:sz="4"/>
+              <w:right w:val="single" w:color="BBBBBB" w:sz="4"/>
+            </w:tcBorders>
+            <w:tcMar>
+              <w:top w:type="dxa" w:w="40"/>
+              <w:left w:type="dxa" w:w="80"/>
+              <w:bottom w:type="dxa" w:w="40"/>
+              <w:right w:type="dxa" w:w="80"/>
+            </w:tcMar>
+          </w:tcPr>
+          <w:p>
+            <w:pPr>
+              <w:spacing w:after="20"/>
+            </w:pPr>
+            <w:r>
+              <w:t xml:space="preserve">ตรวจงานกับข้อกำหนดของโจทย์ แล้วส่งงานทาง Classroom</w:t>
             </w:r>
           </w:p>
         </w:tc>

</xml_diff>